<commit_message>
Update demos to the latest version 26.1
</commit_message>
<xml_diff>
--- a/Blazor/BlazorDemo.ServerSide/CS/BlazorDemo/Data/Documents/ActiveCustomers.docx
+++ b/Blazor/BlazorDemo.ServerSide/CS/BlazorDemo/Data/Documents/ActiveCustomers.docx
@@ -235,7 +235,7 @@
                 <wp:inline distT="0" distB="0" distL="0" distR="0" wp14:anchorId="7BB8863F" wp14:editId="2EED9842">
                   <wp:extent cx="946800" cy="946800"/>
                   <wp:effectExtent l="0" t="0" r="5715" b="5715"/>
-                  <wp:docPr id="1363348063" name="Picture 56"/>
+                  <wp:docPr id="1363348063" name="Picture 56" descr="Photo of Ryan Anita W"/>
                   <wp:cNvGraphicFramePr>
                     <a:graphicFrameLocks xmlns:a="http://schemas.openxmlformats.org/drawingml/2006/main"/>
                   </wp:cNvGraphicFramePr>
@@ -243,7 +243,7 @@
                     <a:graphicData uri="http://schemas.openxmlformats.org/drawingml/2006/picture">
                       <pic:pic xmlns:pic="http://schemas.openxmlformats.org/drawingml/2006/picture">
                         <pic:nvPicPr>
-                          <pic:cNvPr id="1" name="Picture 56"/>
+                          <pic:cNvPr id="1" name="Picture 56" descr="Photo of Ryan Anita W"/>
                           <pic:cNvPicPr preferRelativeResize="0">
                             <a:picLocks noChangeArrowheads="1"/>
                           </pic:cNvPicPr>
@@ -577,7 +577,7 @@
                 <wp:inline distT="0" distB="0" distL="0" distR="0" wp14:anchorId="1ECCB2B1" wp14:editId="790D2368">
                   <wp:extent cx="948055" cy="948055"/>
                   <wp:effectExtent l="0" t="0" r="4445" b="4445"/>
-                  <wp:docPr id="1644567883" name="Picture 55"/>
+                  <wp:docPr id="1644567883" name="Picture 55" descr="Photo of Cardle Anita L"/>
                   <wp:cNvGraphicFramePr>
                     <a:graphicFrameLocks xmlns:a="http://schemas.openxmlformats.org/drawingml/2006/main"/>
                   </wp:cNvGraphicFramePr>
@@ -585,7 +585,7 @@
                     <a:graphicData uri="http://schemas.openxmlformats.org/drawingml/2006/picture">
                       <pic:pic xmlns:pic="http://schemas.openxmlformats.org/drawingml/2006/picture">
                         <pic:nvPicPr>
-                          <pic:cNvPr id="2" name="Picture 55"/>
+                          <pic:cNvPr id="2" name="Picture 55" descr="Photo of Cardle Anita L"/>
                           <pic:cNvPicPr preferRelativeResize="0">
                             <a:picLocks noChangeArrowheads="1"/>
                           </pic:cNvPicPr>
@@ -937,7 +937,7 @@
                 <wp:inline distT="0" distB="0" distL="0" distR="0" wp14:anchorId="6683A0A7" wp14:editId="5FDA91A0">
                   <wp:extent cx="948055" cy="948055"/>
                   <wp:effectExtent l="0" t="0" r="4445" b="4445"/>
-                  <wp:docPr id="1873570281" name="Picture 54"/>
+                  <wp:docPr id="1873570281" name="Picture 54" descr="Photo of Borrmann Aaron Lewis"/>
                   <wp:cNvGraphicFramePr>
                     <a:graphicFrameLocks xmlns:a="http://schemas.openxmlformats.org/drawingml/2006/main"/>
                   </wp:cNvGraphicFramePr>
@@ -945,7 +945,7 @@
                     <a:graphicData uri="http://schemas.openxmlformats.org/drawingml/2006/picture">
                       <pic:pic xmlns:pic="http://schemas.openxmlformats.org/drawingml/2006/picture">
                         <pic:nvPicPr>
-                          <pic:cNvPr id="3" name="Picture 54"/>
+                          <pic:cNvPr id="3" name="Picture 54" descr="Photo of Borrmann Aaron Lewis"/>
                           <pic:cNvPicPr preferRelativeResize="0">
                             <a:picLocks noChangeArrowheads="1"/>
                           </pic:cNvPicPr>
@@ -1279,7 +1279,7 @@
                 <wp:inline distT="0" distB="0" distL="0" distR="0" wp14:anchorId="25B75D91" wp14:editId="43EEDB80">
                   <wp:extent cx="948055" cy="948055"/>
                   <wp:effectExtent l="0" t="0" r="4445" b="4445"/>
-                  <wp:docPr id="1253842350" name="Picture 53"/>
+                  <wp:docPr id="1253842350" name="Picture 53" descr="Photo of Vicars Annie"/>
                   <wp:cNvGraphicFramePr>
                     <a:graphicFrameLocks xmlns:a="http://schemas.openxmlformats.org/drawingml/2006/main"/>
                   </wp:cNvGraphicFramePr>
@@ -1287,7 +1287,7 @@
                     <a:graphicData uri="http://schemas.openxmlformats.org/drawingml/2006/picture">
                       <pic:pic xmlns:pic="http://schemas.openxmlformats.org/drawingml/2006/picture">
                         <pic:nvPicPr>
-                          <pic:cNvPr id="4" name="Picture 53"/>
+                          <pic:cNvPr id="4" name="Picture 53" descr="Photo of Vicars Annie"/>
                           <pic:cNvPicPr preferRelativeResize="0">
                             <a:picLocks noChangeArrowheads="1"/>
                           </pic:cNvPicPr>
@@ -1621,7 +1621,7 @@
                 <wp:inline distT="0" distB="0" distL="0" distR="0" wp14:anchorId="76667859" wp14:editId="127DCF5F">
                   <wp:extent cx="948055" cy="948055"/>
                   <wp:effectExtent l="0" t="0" r="4445" b="4445"/>
-                  <wp:docPr id="478453630" name="Picture 52"/>
+                  <wp:docPr id="478453630" name="Picture 52" descr="Photo of Johnson Alphonso D"/>
                   <wp:cNvGraphicFramePr>
                     <a:graphicFrameLocks xmlns:a="http://schemas.openxmlformats.org/drawingml/2006/main"/>
                   </wp:cNvGraphicFramePr>
@@ -1629,7 +1629,7 @@
                     <a:graphicData uri="http://schemas.openxmlformats.org/drawingml/2006/picture">
                       <pic:pic xmlns:pic="http://schemas.openxmlformats.org/drawingml/2006/picture">
                         <pic:nvPicPr>
-                          <pic:cNvPr id="5" name="Picture 52"/>
+                          <pic:cNvPr id="5" name="Picture 52" descr="Photo of Johnson Alphonso D"/>
                           <pic:cNvPicPr preferRelativeResize="0">
                             <a:picLocks noChangeArrowheads="1"/>
                           </pic:cNvPicPr>
@@ -1963,7 +1963,7 @@
                 <wp:inline distT="0" distB="0" distL="0" distR="0" wp14:anchorId="01B68D31" wp14:editId="03099727">
                   <wp:extent cx="948055" cy="948055"/>
                   <wp:effectExtent l="0" t="0" r="4445" b="4445"/>
-                  <wp:docPr id="1756833244" name="Picture 51"/>
+                  <wp:docPr id="1756833244" name="Picture 51" descr="Photo of Korszniak"/>
                   <wp:cNvGraphicFramePr>
                     <a:graphicFrameLocks xmlns:a="http://schemas.openxmlformats.org/drawingml/2006/main"/>
                   </wp:cNvGraphicFramePr>
@@ -1971,7 +1971,7 @@
                     <a:graphicData uri="http://schemas.openxmlformats.org/drawingml/2006/picture">
                       <pic:pic xmlns:pic="http://schemas.openxmlformats.org/drawingml/2006/picture">
                         <pic:nvPicPr>
-                          <pic:cNvPr id="6" name="Picture 51"/>
+                          <pic:cNvPr id="6" name="Picture 51" descr="Photo of Korszniak"/>
                           <pic:cNvPicPr preferRelativeResize="0">
                             <a:picLocks noChangeArrowheads="1"/>
                           </pic:cNvPicPr>
@@ -2316,7 +2316,7 @@
                 <wp:inline distT="0" distB="0" distL="0" distR="0" wp14:anchorId="3DCAF9D2" wp14:editId="1B03891F">
                   <wp:extent cx="948055" cy="948055"/>
                   <wp:effectExtent l="0" t="0" r="4445" b="4445"/>
-                  <wp:docPr id="1630194581" name="Picture 50"/>
+                  <wp:docPr id="1630194581" name="Picture 50" descr="Photo of Baker Carolyn"/>
                   <wp:cNvGraphicFramePr>
                     <a:graphicFrameLocks xmlns:a="http://schemas.openxmlformats.org/drawingml/2006/main"/>
                   </wp:cNvGraphicFramePr>
@@ -2324,7 +2324,7 @@
                     <a:graphicData uri="http://schemas.openxmlformats.org/drawingml/2006/picture">
                       <pic:pic xmlns:pic="http://schemas.openxmlformats.org/drawingml/2006/picture">
                         <pic:nvPicPr>
-                          <pic:cNvPr id="7" name="Picture 50"/>
+                          <pic:cNvPr id="7" name="Picture 50" descr="Photo of Baker Carolyn"/>
                           <pic:cNvPicPr preferRelativeResize="0">
                             <a:picLocks noChangeArrowheads="1"/>
                           </pic:cNvPicPr>
@@ -2658,7 +2658,7 @@
                 <wp:inline distT="0" distB="0" distL="0" distR="0" wp14:anchorId="312E69D2" wp14:editId="53C1BE79">
                   <wp:extent cx="948055" cy="948055"/>
                   <wp:effectExtent l="0" t="0" r="4445" b="4445"/>
-                  <wp:docPr id="327958039" name="Picture 49"/>
+                  <wp:docPr id="327958039" name="Picture 49" descr="Photo of Oneil Beverly"/>
                   <wp:cNvGraphicFramePr>
                     <a:graphicFrameLocks xmlns:a="http://schemas.openxmlformats.org/drawingml/2006/main"/>
                   </wp:cNvGraphicFramePr>
@@ -2666,7 +2666,7 @@
                     <a:graphicData uri="http://schemas.openxmlformats.org/drawingml/2006/picture">
                       <pic:pic xmlns:pic="http://schemas.openxmlformats.org/drawingml/2006/picture">
                         <pic:nvPicPr>
-                          <pic:cNvPr id="8" name="Picture 49"/>
+                          <pic:cNvPr id="8" name="Picture 49" descr="Photo of Oneil Beverly"/>
                           <pic:cNvPicPr preferRelativeResize="0">
                             <a:picLocks noChangeArrowheads="1"/>
                           </pic:cNvPicPr>
@@ -3000,7 +3000,7 @@
                 <wp:inline distT="0" distB="0" distL="0" distR="0" wp14:anchorId="43B21CAA" wp14:editId="23027C27">
                   <wp:extent cx="948055" cy="948055"/>
                   <wp:effectExtent l="0" t="0" r="4445" b="4445"/>
-                  <wp:docPr id="1825743652" name="Picture 48"/>
+                  <wp:docPr id="1825743652" name="Picture 48" descr="Photo of Bradley Donald Dozier"/>
                   <wp:cNvGraphicFramePr>
                     <a:graphicFrameLocks xmlns:a="http://schemas.openxmlformats.org/drawingml/2006/main"/>
                   </wp:cNvGraphicFramePr>
@@ -3008,7 +3008,7 @@
                     <a:graphicData uri="http://schemas.openxmlformats.org/drawingml/2006/picture">
                       <pic:pic xmlns:pic="http://schemas.openxmlformats.org/drawingml/2006/picture">
                         <pic:nvPicPr>
-                          <pic:cNvPr id="9" name="Picture 48"/>
+                          <pic:cNvPr id="9" name="Picture 48" descr="Photo of Bradley Donald Dozier"/>
                           <pic:cNvPicPr preferRelativeResize="0">
                             <a:picLocks noChangeArrowheads="1"/>
                           </pic:cNvPicPr>
@@ -3342,7 +3342,7 @@
                 <wp:inline distT="0" distB="0" distL="0" distR="0" wp14:anchorId="3161A834" wp14:editId="0A7EAA09">
                   <wp:extent cx="948055" cy="948055"/>
                   <wp:effectExtent l="0" t="0" r="4445" b="4445"/>
-                  <wp:docPr id="796907804" name="Picture 47"/>
+                  <wp:docPr id="796907804" name="Picture 47" descr="Photo of Keck Edward"/>
                   <wp:cNvGraphicFramePr>
                     <a:graphicFrameLocks xmlns:a="http://schemas.openxmlformats.org/drawingml/2006/main"/>
                   </wp:cNvGraphicFramePr>
@@ -3350,7 +3350,7 @@
                     <a:graphicData uri="http://schemas.openxmlformats.org/drawingml/2006/picture">
                       <pic:pic xmlns:pic="http://schemas.openxmlformats.org/drawingml/2006/picture">
                         <pic:nvPicPr>
-                          <pic:cNvPr id="10" name="Picture 47"/>
+                          <pic:cNvPr id="10" name="Picture 47" descr="Photo of Keck Edward"/>
                           <pic:cNvPicPr preferRelativeResize="0">
                             <a:picLocks noChangeArrowheads="1"/>
                           </pic:cNvPicPr>
@@ -3684,7 +3684,7 @@
                 <wp:inline distT="0" distB="0" distL="0" distR="0" wp14:anchorId="384DD843" wp14:editId="1D6E56A3">
                   <wp:extent cx="948055" cy="948055"/>
                   <wp:effectExtent l="0" t="0" r="4445" b="4445"/>
-                  <wp:docPr id="1658464388" name="Picture 46"/>
+                  <wp:docPr id="1658464388" name="Picture 46" descr="Photo of Aguilar Clementine Luis"/>
                   <wp:cNvGraphicFramePr>
                     <a:graphicFrameLocks xmlns:a="http://schemas.openxmlformats.org/drawingml/2006/main"/>
                   </wp:cNvGraphicFramePr>
@@ -3692,7 +3692,7 @@
                     <a:graphicData uri="http://schemas.openxmlformats.org/drawingml/2006/picture">
                       <pic:pic xmlns:pic="http://schemas.openxmlformats.org/drawingml/2006/picture">
                         <pic:nvPicPr>
-                          <pic:cNvPr id="11" name="Picture 46"/>
+                          <pic:cNvPr id="11" name="Picture 46" descr="Photo of Aguilar Clementine Luis"/>
                           <pic:cNvPicPr preferRelativeResize="0">
                             <a:picLocks noChangeArrowheads="1"/>
                           </pic:cNvPicPr>
@@ -4026,7 +4026,7 @@
                 <wp:inline distT="0" distB="0" distL="0" distR="0" wp14:anchorId="2CFE6BF4" wp14:editId="37804715">
                   <wp:extent cx="948055" cy="948055"/>
                   <wp:effectExtent l="0" t="0" r="4445" b="4445"/>
-                  <wp:docPr id="1236957638" name="Picture 45"/>
+                  <wp:docPr id="1236957638" name="Picture 45" descr="Photo of Nolan Alfred"/>
                   <wp:cNvGraphicFramePr>
                     <a:graphicFrameLocks xmlns:a="http://schemas.openxmlformats.org/drawingml/2006/main"/>
                   </wp:cNvGraphicFramePr>
@@ -4034,7 +4034,7 @@
                     <a:graphicData uri="http://schemas.openxmlformats.org/drawingml/2006/picture">
                       <pic:pic xmlns:pic="http://schemas.openxmlformats.org/drawingml/2006/picture">
                         <pic:nvPicPr>
-                          <pic:cNvPr id="12" name="Picture 45"/>
+                          <pic:cNvPr id="12" name="Picture 45" descr="Photo of Nolan Alfred"/>
                           <pic:cNvPicPr preferRelativeResize="0">
                             <a:picLocks noChangeArrowheads="1"/>
                           </pic:cNvPicPr>
@@ -4368,7 +4368,7 @@
                 <wp:inline distT="0" distB="0" distL="0" distR="0" wp14:anchorId="4F33C97E" wp14:editId="10C5D0F3">
                   <wp:extent cx="948055" cy="948055"/>
                   <wp:effectExtent l="0" t="0" r="4445" b="4445"/>
-                  <wp:docPr id="1059122182" name="Picture 44"/>
+                  <wp:docPr id="1059122182" name="Picture 44" descr="Photo of Aiello Hewitt A"/>
                   <wp:cNvGraphicFramePr>
                     <a:graphicFrameLocks xmlns:a="http://schemas.openxmlformats.org/drawingml/2006/main"/>
                   </wp:cNvGraphicFramePr>
@@ -4376,7 +4376,7 @@
                     <a:graphicData uri="http://schemas.openxmlformats.org/drawingml/2006/picture">
                       <pic:pic xmlns:pic="http://schemas.openxmlformats.org/drawingml/2006/picture">
                         <pic:nvPicPr>
-                          <pic:cNvPr id="13" name="Picture 44"/>
+                          <pic:cNvPr id="13" name="Picture 44" descr="Photo of Aiello Hewitt A"/>
                           <pic:cNvPicPr preferRelativeResize="0">
                             <a:picLocks noChangeArrowheads="1"/>
                           </pic:cNvPicPr>
@@ -4710,7 +4710,7 @@
                 <wp:inline distT="0" distB="0" distL="0" distR="0" wp14:anchorId="0FEDBC84" wp14:editId="2E65DD4F">
                   <wp:extent cx="948055" cy="948055"/>
                   <wp:effectExtent l="0" t="0" r="4445" b="4445"/>
-                  <wp:docPr id="195906025" name="Picture 43"/>
+                  <wp:docPr id="195906025" name="Picture 43" descr="Photo of Hanna Angelia D"/>
                   <wp:cNvGraphicFramePr>
                     <a:graphicFrameLocks xmlns:a="http://schemas.openxmlformats.org/drawingml/2006/main"/>
                   </wp:cNvGraphicFramePr>
@@ -4718,7 +4718,7 @@
                     <a:graphicData uri="http://schemas.openxmlformats.org/drawingml/2006/picture">
                       <pic:pic xmlns:pic="http://schemas.openxmlformats.org/drawingml/2006/picture">
                         <pic:nvPicPr>
-                          <pic:cNvPr id="14" name="Picture 43"/>
+                          <pic:cNvPr id="14" name="Picture 43" descr="Photo of Hanna Angelia D"/>
                           <pic:cNvPicPr preferRelativeResize="0">
                             <a:picLocks noChangeArrowheads="1"/>
                           </pic:cNvPicPr>
@@ -5088,7 +5088,7 @@
                 <wp:inline distT="0" distB="0" distL="0" distR="0" wp14:anchorId="14E7F2DF" wp14:editId="215D2051">
                   <wp:extent cx="948055" cy="948055"/>
                   <wp:effectExtent l="0" t="0" r="4445" b="4445"/>
-                  <wp:docPr id="884754824" name="Picture 42"/>
+                  <wp:docPr id="884754824" name="Picture 42" descr="Photo of Melton Alex D"/>
                   <wp:cNvGraphicFramePr>
                     <a:graphicFrameLocks xmlns:a="http://schemas.openxmlformats.org/drawingml/2006/main"/>
                   </wp:cNvGraphicFramePr>
@@ -5096,7 +5096,7 @@
                     <a:graphicData uri="http://schemas.openxmlformats.org/drawingml/2006/picture">
                       <pic:pic xmlns:pic="http://schemas.openxmlformats.org/drawingml/2006/picture">
                         <pic:nvPicPr>
-                          <pic:cNvPr id="15" name="Picture 42"/>
+                          <pic:cNvPr id="15" name="Picture 42" descr="Photo of Melton Alex D"/>
                           <pic:cNvPicPr preferRelativeResize="0">
                             <a:picLocks noChangeArrowheads="1"/>
                           </pic:cNvPicPr>
@@ -5430,7 +5430,7 @@
                 <wp:inline distT="0" distB="0" distL="0" distR="0" wp14:anchorId="0CAD8BF6" wp14:editId="78DF093F">
                   <wp:extent cx="948055" cy="948055"/>
                   <wp:effectExtent l="0" t="0" r="4445" b="4445"/>
-                  <wp:docPr id="1167199237" name="Picture 41"/>
+                  <wp:docPr id="1167199237" name="Picture 41" descr="Photo of Rounds Anthony Vernon"/>
                   <wp:cNvGraphicFramePr>
                     <a:graphicFrameLocks xmlns:a="http://schemas.openxmlformats.org/drawingml/2006/main"/>
                   </wp:cNvGraphicFramePr>
@@ -5438,7 +5438,7 @@
                     <a:graphicData uri="http://schemas.openxmlformats.org/drawingml/2006/picture">
                       <pic:pic xmlns:pic="http://schemas.openxmlformats.org/drawingml/2006/picture">
                         <pic:nvPicPr>
-                          <pic:cNvPr id="16" name="Picture 41"/>
+                          <pic:cNvPr id="16" name="Picture 41" descr="Photo of Rounds Anthony Vernon"/>
                           <pic:cNvPicPr preferRelativeResize="0">
                             <a:picLocks noChangeArrowheads="1"/>
                           </pic:cNvPicPr>
@@ -5772,7 +5772,7 @@
                 <wp:inline distT="0" distB="0" distL="0" distR="0" wp14:anchorId="1F72AE86" wp14:editId="0D9E0F3E">
                   <wp:extent cx="948055" cy="948055"/>
                   <wp:effectExtent l="0" t="0" r="4445" b="4445"/>
-                  <wp:docPr id="109168477" name="Picture 40"/>
+                  <wp:docPr id="109168477" name="Picture 40" descr="Photo of Etter Allison L"/>
                   <wp:cNvGraphicFramePr>
                     <a:graphicFrameLocks xmlns:a="http://schemas.openxmlformats.org/drawingml/2006/main"/>
                   </wp:cNvGraphicFramePr>
@@ -5780,7 +5780,7 @@
                     <a:graphicData uri="http://schemas.openxmlformats.org/drawingml/2006/picture">
                       <pic:pic xmlns:pic="http://schemas.openxmlformats.org/drawingml/2006/picture">
                         <pic:nvPicPr>
-                          <pic:cNvPr id="17" name="Picture 40"/>
+                          <pic:cNvPr id="17" name="Picture 40" descr="Photo of Etter Allison L"/>
                           <pic:cNvPicPr preferRelativeResize="0">
                             <a:picLocks noChangeArrowheads="1"/>
                           </pic:cNvPicPr>
@@ -6132,7 +6132,7 @@
                 <wp:inline distT="0" distB="0" distL="0" distR="0" wp14:anchorId="03BB78B9" wp14:editId="4A12F15A">
                   <wp:extent cx="948055" cy="948055"/>
                   <wp:effectExtent l="0" t="0" r="4445" b="4445"/>
-                  <wp:docPr id="632896713" name="Picture 39"/>
+                  <wp:docPr id="632896713" name="Picture 39" descr="Photo of Scott Rachel"/>
                   <wp:cNvGraphicFramePr>
                     <a:graphicFrameLocks xmlns:a="http://schemas.openxmlformats.org/drawingml/2006/main"/>
                   </wp:cNvGraphicFramePr>
@@ -6140,7 +6140,7 @@
                     <a:graphicData uri="http://schemas.openxmlformats.org/drawingml/2006/picture">
                       <pic:pic xmlns:pic="http://schemas.openxmlformats.org/drawingml/2006/picture">
                         <pic:nvPicPr>
-                          <pic:cNvPr id="18" name="Picture 39"/>
+                          <pic:cNvPr id="18" name="Picture 39" descr="Photo of Scott Rachel"/>
                           <pic:cNvPicPr preferRelativeResize="0">
                             <a:picLocks noChangeArrowheads="1"/>
                           </pic:cNvPicPr>
@@ -6474,7 +6474,7 @@
                 <wp:inline distT="0" distB="0" distL="0" distR="0" wp14:anchorId="53C1E09C" wp14:editId="4FD2B57C">
                   <wp:extent cx="948055" cy="948055"/>
                   <wp:effectExtent l="0" t="0" r="4445" b="4445"/>
-                  <wp:docPr id="1633246646" name="Picture 38"/>
+                  <wp:docPr id="1633246646" name="Picture 38" descr="Photo of Deville Andrea"/>
                   <wp:cNvGraphicFramePr>
                     <a:graphicFrameLocks xmlns:a="http://schemas.openxmlformats.org/drawingml/2006/main"/>
                   </wp:cNvGraphicFramePr>
@@ -6482,7 +6482,7 @@
                     <a:graphicData uri="http://schemas.openxmlformats.org/drawingml/2006/picture">
                       <pic:pic xmlns:pic="http://schemas.openxmlformats.org/drawingml/2006/picture">
                         <pic:nvPicPr>
-                          <pic:cNvPr id="19" name="Picture 38"/>
+                          <pic:cNvPr id="19" name="Picture 38" descr="Photo of Deville Andrea"/>
                           <pic:cNvPicPr preferRelativeResize="0">
                             <a:picLocks noChangeArrowheads="1"/>
                           </pic:cNvPicPr>
@@ -6834,7 +6834,7 @@
                 <wp:inline distT="0" distB="0" distL="0" distR="0" wp14:anchorId="618936B4" wp14:editId="68047D5E">
                   <wp:extent cx="948055" cy="948055"/>
                   <wp:effectExtent l="0" t="0" r="4445" b="4445"/>
-                  <wp:docPr id="855855887" name="Picture 37"/>
+                  <wp:docPr id="855855887" name="Picture 37" descr="Photo of Cambell Bruce F"/>
                   <wp:cNvGraphicFramePr>
                     <a:graphicFrameLocks xmlns:a="http://schemas.openxmlformats.org/drawingml/2006/main"/>
                   </wp:cNvGraphicFramePr>
@@ -6842,7 +6842,7 @@
                     <a:graphicData uri="http://schemas.openxmlformats.org/drawingml/2006/picture">
                       <pic:pic xmlns:pic="http://schemas.openxmlformats.org/drawingml/2006/picture">
                         <pic:nvPicPr>
-                          <pic:cNvPr id="20" name="Picture 37"/>
+                          <pic:cNvPr id="20" name="Picture 37" descr="Photo of Cambell Bruce F"/>
                           <pic:cNvPicPr preferRelativeResize="0">
                             <a:picLocks noChangeArrowheads="1"/>
                           </pic:cNvPicPr>
@@ -7176,7 +7176,7 @@
                 <wp:inline distT="0" distB="0" distL="0" distR="0" wp14:anchorId="0F4A6128" wp14:editId="337E057D">
                   <wp:extent cx="948055" cy="948055"/>
                   <wp:effectExtent l="0" t="0" r="4445" b="4445"/>
-                  <wp:docPr id="1154162969" name="Picture 36"/>
+                  <wp:docPr id="1154162969" name="Picture 36" descr="Photo of Benson Anita A"/>
                   <wp:cNvGraphicFramePr>
                     <a:graphicFrameLocks xmlns:a="http://schemas.openxmlformats.org/drawingml/2006/main"/>
                   </wp:cNvGraphicFramePr>
@@ -7184,7 +7184,7 @@
                     <a:graphicData uri="http://schemas.openxmlformats.org/drawingml/2006/picture">
                       <pic:pic xmlns:pic="http://schemas.openxmlformats.org/drawingml/2006/picture">
                         <pic:nvPicPr>
-                          <pic:cNvPr id="21" name="Picture 36"/>
+                          <pic:cNvPr id="21" name="Picture 36" descr="Photo of Benson Anita A"/>
                           <pic:cNvPicPr preferRelativeResize="0">
                             <a:picLocks noChangeArrowheads="1"/>
                           </pic:cNvPicPr>
@@ -7518,7 +7518,7 @@
                 <wp:inline distT="0" distB="0" distL="0" distR="0" wp14:anchorId="04A54A9B" wp14:editId="542BC6A4">
                   <wp:extent cx="948055" cy="948055"/>
                   <wp:effectExtent l="0" t="0" r="4445" b="4445"/>
-                  <wp:docPr id="1053131582" name="Picture 35"/>
+                  <wp:docPr id="1053131582" name="Picture 35" descr="Photo of Bevington Chandler"/>
                   <wp:cNvGraphicFramePr>
                     <a:graphicFrameLocks xmlns:a="http://schemas.openxmlformats.org/drawingml/2006/main"/>
                   </wp:cNvGraphicFramePr>
@@ -7526,7 +7526,7 @@
                     <a:graphicData uri="http://schemas.openxmlformats.org/drawingml/2006/picture">
                       <pic:pic xmlns:pic="http://schemas.openxmlformats.org/drawingml/2006/picture">
                         <pic:nvPicPr>
-                          <pic:cNvPr id="22" name="Picture 35"/>
+                          <pic:cNvPr id="22" name="Picture 35" descr="Photo of Bevington Chandler"/>
                           <pic:cNvPicPr preferRelativeResize="0">
                             <a:picLocks noChangeArrowheads="1"/>
                           </pic:cNvPicPr>
@@ -7860,7 +7860,7 @@
                 <wp:inline distT="0" distB="0" distL="0" distR="0" wp14:anchorId="2E707378" wp14:editId="2B0AA008">
                   <wp:extent cx="948055" cy="948055"/>
                   <wp:effectExtent l="0" t="0" r="4445" b="4445"/>
-                  <wp:docPr id="953333095" name="Picture 34"/>
+                  <wp:docPr id="953333095" name="Picture 34" descr="Photo of Chinavare Barbara"/>
                   <wp:cNvGraphicFramePr>
                     <a:graphicFrameLocks xmlns:a="http://schemas.openxmlformats.org/drawingml/2006/main"/>
                   </wp:cNvGraphicFramePr>
@@ -7868,7 +7868,7 @@
                     <a:graphicData uri="http://schemas.openxmlformats.org/drawingml/2006/picture">
                       <pic:pic xmlns:pic="http://schemas.openxmlformats.org/drawingml/2006/picture">
                         <pic:nvPicPr>
-                          <pic:cNvPr id="23" name="Picture 34"/>
+                          <pic:cNvPr id="23" name="Picture 34" descr="Photo of Chinavare Barbara"/>
                           <pic:cNvPicPr preferRelativeResize="0">
                             <a:picLocks noChangeArrowheads="1"/>
                           </pic:cNvPicPr>
@@ -8238,7 +8238,7 @@
                 <wp:inline distT="0" distB="0" distL="0" distR="0" wp14:anchorId="51AA19CA" wp14:editId="05AC2DC8">
                   <wp:extent cx="948055" cy="940219"/>
                   <wp:effectExtent l="0" t="0" r="4445" b="0"/>
-                  <wp:docPr id="116307072" name="Picture 33"/>
+                  <wp:docPr id="116307072" name="Picture 33" descr="Photo of Holloway George N"/>
                   <wp:cNvGraphicFramePr>
                     <a:graphicFrameLocks xmlns:a="http://schemas.openxmlformats.org/drawingml/2006/main"/>
                   </wp:cNvGraphicFramePr>
@@ -8246,7 +8246,7 @@
                     <a:graphicData uri="http://schemas.openxmlformats.org/drawingml/2006/picture">
                       <pic:pic xmlns:pic="http://schemas.openxmlformats.org/drawingml/2006/picture">
                         <pic:nvPicPr>
-                          <pic:cNvPr id="24" name="Picture 33"/>
+                          <pic:cNvPr id="24" name="Picture 33" descr="Photo of Holloway George N"/>
                           <pic:cNvPicPr preferRelativeResize="0">
                             <a:picLocks noChangeArrowheads="1"/>
                           </pic:cNvPicPr>
@@ -8580,7 +8580,7 @@
                 <wp:inline distT="0" distB="0" distL="0" distR="0" wp14:anchorId="39650B80" wp14:editId="74771007">
                   <wp:extent cx="948055" cy="936350"/>
                   <wp:effectExtent l="0" t="0" r="4445" b="0"/>
-                  <wp:docPr id="732614006" name="Picture 32"/>
+                  <wp:docPr id="732614006" name="Picture 32" descr="Photo of Matese"/>
                   <wp:cNvGraphicFramePr>
                     <a:graphicFrameLocks xmlns:a="http://schemas.openxmlformats.org/drawingml/2006/main"/>
                   </wp:cNvGraphicFramePr>
@@ -8588,7 +8588,7 @@
                     <a:graphicData uri="http://schemas.openxmlformats.org/drawingml/2006/picture">
                       <pic:pic xmlns:pic="http://schemas.openxmlformats.org/drawingml/2006/picture">
                         <pic:nvPicPr>
-                          <pic:cNvPr id="25" name="Picture 32"/>
+                          <pic:cNvPr id="25" name="Picture 32" descr="Photo of Matese"/>
                           <pic:cNvPicPr preferRelativeResize="0">
                             <a:picLocks noChangeArrowheads="1"/>
                           </pic:cNvPicPr>
@@ -8951,7 +8951,7 @@
                 <wp:inline distT="0" distB="0" distL="0" distR="0" wp14:anchorId="16AED747" wp14:editId="4C8586A6">
                   <wp:extent cx="948055" cy="948055"/>
                   <wp:effectExtent l="0" t="0" r="4445" b="4445"/>
-                  <wp:docPr id="1507665669" name="Picture 31"/>
+                  <wp:docPr id="1507665669" name="Picture 31" descr="Photo of Crimmins Dora"/>
                   <wp:cNvGraphicFramePr>
                     <a:graphicFrameLocks xmlns:a="http://schemas.openxmlformats.org/drawingml/2006/main"/>
                   </wp:cNvGraphicFramePr>
@@ -8959,7 +8959,7 @@
                     <a:graphicData uri="http://schemas.openxmlformats.org/drawingml/2006/picture">
                       <pic:pic xmlns:pic="http://schemas.openxmlformats.org/drawingml/2006/picture">
                         <pic:nvPicPr>
-                          <pic:cNvPr id="26" name="Picture 31"/>
+                          <pic:cNvPr id="26" name="Picture 31" descr="Photo of Crimmins Dora"/>
                           <pic:cNvPicPr preferRelativeResize="0">
                             <a:picLocks noChangeArrowheads="1"/>
                           </pic:cNvPicPr>
@@ -9293,7 +9293,7 @@
                 <wp:inline distT="0" distB="0" distL="0" distR="0" wp14:anchorId="398B6F90" wp14:editId="3543B850">
                   <wp:extent cx="948055" cy="948055"/>
                   <wp:effectExtent l="0" t="0" r="4445" b="4445"/>
-                  <wp:docPr id="157802508" name="Picture 30"/>
+                  <wp:docPr id="157802508" name="Picture 30" descr="Photo of Boyd Anita A"/>
                   <wp:cNvGraphicFramePr>
                     <a:graphicFrameLocks xmlns:a="http://schemas.openxmlformats.org/drawingml/2006/main"/>
                   </wp:cNvGraphicFramePr>
@@ -9301,7 +9301,7 @@
                     <a:graphicData uri="http://schemas.openxmlformats.org/drawingml/2006/picture">
                       <pic:pic xmlns:pic="http://schemas.openxmlformats.org/drawingml/2006/picture">
                         <pic:nvPicPr>
-                          <pic:cNvPr id="27" name="Picture 30"/>
+                          <pic:cNvPr id="27" name="Picture 30" descr="Photo of Boyd Anita A"/>
                           <pic:cNvPicPr preferRelativeResize="0">
                             <a:picLocks noChangeArrowheads="1"/>
                           </pic:cNvPicPr>
@@ -9635,7 +9635,7 @@
                 <wp:inline distT="0" distB="0" distL="0" distR="0" wp14:anchorId="0202961B" wp14:editId="38453066">
                   <wp:extent cx="948055" cy="946083"/>
                   <wp:effectExtent l="0" t="0" r="4445" b="6985"/>
-                  <wp:docPr id="1865433116" name="Picture 29"/>
+                  <wp:docPr id="1865433116" name="Picture 29" descr="Photo of Seaman Amber Lee"/>
                   <wp:cNvGraphicFramePr>
                     <a:graphicFrameLocks xmlns:a="http://schemas.openxmlformats.org/drawingml/2006/main"/>
                   </wp:cNvGraphicFramePr>
@@ -9643,7 +9643,7 @@
                     <a:graphicData uri="http://schemas.openxmlformats.org/drawingml/2006/picture">
                       <pic:pic xmlns:pic="http://schemas.openxmlformats.org/drawingml/2006/picture">
                         <pic:nvPicPr>
-                          <pic:cNvPr id="28" name="Picture 29"/>
+                          <pic:cNvPr id="28" name="Picture 29" descr="Photo of Seaman Amber Lee"/>
                           <pic:cNvPicPr preferRelativeResize="0">
                             <a:picLocks noChangeArrowheads="1"/>
                           </pic:cNvPicPr>
@@ -9977,7 +9977,7 @@
                 <wp:inline distT="0" distB="0" distL="0" distR="0" wp14:anchorId="515E8170" wp14:editId="31988200">
                   <wp:extent cx="948055" cy="948055"/>
                   <wp:effectExtent l="0" t="0" r="4445" b="4445"/>
-                  <wp:docPr id="17929918" name="Picture 28"/>
+                  <wp:docPr id="17929918" name="Picture 28" descr="Photo of Peterson Anthony"/>
                   <wp:cNvGraphicFramePr>
                     <a:graphicFrameLocks xmlns:a="http://schemas.openxmlformats.org/drawingml/2006/main"/>
                   </wp:cNvGraphicFramePr>
@@ -9985,7 +9985,7 @@
                     <a:graphicData uri="http://schemas.openxmlformats.org/drawingml/2006/picture">
                       <pic:pic xmlns:pic="http://schemas.openxmlformats.org/drawingml/2006/picture">
                         <pic:nvPicPr>
-                          <pic:cNvPr id="30" name="Picture 28"/>
+                          <pic:cNvPr id="30" name="Picture 28" descr="Photo of Peterson Anthony"/>
                           <pic:cNvPicPr preferRelativeResize="0">
                             <a:picLocks noChangeArrowheads="1"/>
                           </pic:cNvPicPr>
@@ -10319,7 +10319,7 @@
                 <wp:inline distT="0" distB="0" distL="0" distR="0" wp14:anchorId="42C00B72" wp14:editId="5C83FF43">
                   <wp:extent cx="948055" cy="948055"/>
                   <wp:effectExtent l="0" t="0" r="4445" b="4445"/>
-                  <wp:docPr id="633810662" name="Picture 27"/>
+                  <wp:docPr id="633810662" name="Picture 27" descr="Photo of Stender Charles Allen"/>
                   <wp:cNvGraphicFramePr>
                     <a:graphicFrameLocks xmlns:a="http://schemas.openxmlformats.org/drawingml/2006/main"/>
                   </wp:cNvGraphicFramePr>
@@ -10327,7 +10327,7 @@
                     <a:graphicData uri="http://schemas.openxmlformats.org/drawingml/2006/picture">
                       <pic:pic xmlns:pic="http://schemas.openxmlformats.org/drawingml/2006/picture">
                         <pic:nvPicPr>
-                          <pic:cNvPr id="31" name="Picture 27"/>
+                          <pic:cNvPr id="31" name="Picture 27" descr="Photo of Stender Charles Allen"/>
                           <pic:cNvPicPr preferRelativeResize="0">
                             <a:picLocks noChangeArrowheads="1"/>
                           </pic:cNvPicPr>
@@ -10661,7 +10661,7 @@
                 <wp:inline distT="0" distB="0" distL="0" distR="0" wp14:anchorId="4EE487ED" wp14:editId="303F8017">
                   <wp:extent cx="948055" cy="948055"/>
                   <wp:effectExtent l="0" t="0" r="4445" b="4445"/>
-                  <wp:docPr id="992897331" name="Picture 26"/>
+                  <wp:docPr id="992897331" name="Picture 26" descr="Photo of Walker Angela L"/>
                   <wp:cNvGraphicFramePr>
                     <a:graphicFrameLocks xmlns:a="http://schemas.openxmlformats.org/drawingml/2006/main"/>
                   </wp:cNvGraphicFramePr>
@@ -10669,7 +10669,7 @@
                     <a:graphicData uri="http://schemas.openxmlformats.org/drawingml/2006/picture">
                       <pic:pic xmlns:pic="http://schemas.openxmlformats.org/drawingml/2006/picture">
                         <pic:nvPicPr>
-                          <pic:cNvPr id="32" name="Picture 26"/>
+                          <pic:cNvPr id="32" name="Picture 26" descr="Photo of Walker Angela L"/>
                           <pic:cNvPicPr preferRelativeResize="0">
                             <a:picLocks noChangeArrowheads="1"/>
                           </pic:cNvPicPr>
@@ -11003,7 +11003,7 @@
                 <wp:inline distT="0" distB="0" distL="0" distR="0" wp14:anchorId="0F21C8E7" wp14:editId="1E24F187">
                   <wp:extent cx="948055" cy="948055"/>
                   <wp:effectExtent l="0" t="0" r="4445" b="4445"/>
-                  <wp:docPr id="1734585401" name="Picture 25"/>
+                  <wp:docPr id="1734585401" name="Picture 25" descr="Photo of Catto Darlene"/>
                   <wp:cNvGraphicFramePr>
                     <a:graphicFrameLocks xmlns:a="http://schemas.openxmlformats.org/drawingml/2006/main"/>
                   </wp:cNvGraphicFramePr>
@@ -11011,7 +11011,7 @@
                     <a:graphicData uri="http://schemas.openxmlformats.org/drawingml/2006/picture">
                       <pic:pic xmlns:pic="http://schemas.openxmlformats.org/drawingml/2006/picture">
                         <pic:nvPicPr>
-                          <pic:cNvPr id="33" name="Picture 25"/>
+                          <pic:cNvPr id="33" name="Picture 25" descr="Photo of Catto Darlene"/>
                           <pic:cNvPicPr preferRelativeResize="0">
                             <a:picLocks noChangeArrowheads="1"/>
                           </pic:cNvPicPr>
@@ -11345,7 +11345,7 @@
                 <wp:inline distT="0" distB="0" distL="0" distR="0" wp14:anchorId="0A5296F2" wp14:editId="1D757FA8">
                   <wp:extent cx="948055" cy="948055"/>
                   <wp:effectExtent l="0" t="0" r="4445" b="4445"/>
-                  <wp:docPr id="1287300975" name="Picture 24"/>
+                  <wp:docPr id="1287300975" name="Picture 24" descr="Photo of Hively Alphonzo E"/>
                   <wp:cNvGraphicFramePr>
                     <a:graphicFrameLocks xmlns:a="http://schemas.openxmlformats.org/drawingml/2006/main"/>
                   </wp:cNvGraphicFramePr>
@@ -11353,7 +11353,7 @@
                     <a:graphicData uri="http://schemas.openxmlformats.org/drawingml/2006/picture">
                       <pic:pic xmlns:pic="http://schemas.openxmlformats.org/drawingml/2006/picture">
                         <pic:nvPicPr>
-                          <pic:cNvPr id="34" name="Picture 24"/>
+                          <pic:cNvPr id="34" name="Picture 24" descr="Photo of Hively Alphonzo E"/>
                           <pic:cNvPicPr preferRelativeResize="0">
                             <a:picLocks noChangeArrowheads="1"/>
                           </pic:cNvPicPr>
@@ -11687,7 +11687,7 @@
                 <wp:inline distT="0" distB="0" distL="0" distR="0" wp14:anchorId="3FAF1D48" wp14:editId="3C033769">
                   <wp:extent cx="948055" cy="948055"/>
                   <wp:effectExtent l="0" t="0" r="4445" b="4445"/>
-                  <wp:docPr id="935768727" name="Picture 23"/>
+                  <wp:docPr id="935768727" name="Picture 23" descr="Photo of Haneline Cindy C"/>
                   <wp:cNvGraphicFramePr>
                     <a:graphicFrameLocks xmlns:a="http://schemas.openxmlformats.org/drawingml/2006/main"/>
                   </wp:cNvGraphicFramePr>
@@ -11695,7 +11695,7 @@
                     <a:graphicData uri="http://schemas.openxmlformats.org/drawingml/2006/picture">
                       <pic:pic xmlns:pic="http://schemas.openxmlformats.org/drawingml/2006/picture">
                         <pic:nvPicPr>
-                          <pic:cNvPr id="35" name="Picture 23"/>
+                          <pic:cNvPr id="35" name="Picture 23" descr="Photo of Haneline Cindy C"/>
                           <pic:cNvPicPr preferRelativeResize="0">
                             <a:picLocks noChangeArrowheads="1"/>
                           </pic:cNvPicPr>
@@ -12029,7 +12029,7 @@
                 <wp:inline distT="0" distB="0" distL="0" distR="0" wp14:anchorId="62719255" wp14:editId="3A07A2E4">
                   <wp:extent cx="948055" cy="948055"/>
                   <wp:effectExtent l="0" t="0" r="4445" b="4445"/>
-                  <wp:docPr id="2026831906" name="Picture 22"/>
+                  <wp:docPr id="2026831906" name="Picture 22" descr="Photo of Walker Albert Bernard"/>
                   <wp:cNvGraphicFramePr>
                     <a:graphicFrameLocks xmlns:a="http://schemas.openxmlformats.org/drawingml/2006/main"/>
                   </wp:cNvGraphicFramePr>
@@ -12037,7 +12037,7 @@
                     <a:graphicData uri="http://schemas.openxmlformats.org/drawingml/2006/picture">
                       <pic:pic xmlns:pic="http://schemas.openxmlformats.org/drawingml/2006/picture">
                         <pic:nvPicPr>
-                          <pic:cNvPr id="36" name="Picture 22"/>
+                          <pic:cNvPr id="36" name="Picture 22" descr="Photo of Walker Albert Bernard"/>
                           <pic:cNvPicPr preferRelativeResize="0">
                             <a:picLocks noChangeArrowheads="1"/>
                           </pic:cNvPicPr>
@@ -12407,7 +12407,7 @@
                 <wp:inline distT="0" distB="0" distL="0" distR="0" wp14:anchorId="5200E0C4" wp14:editId="06BB942D">
                   <wp:extent cx="948055" cy="948055"/>
                   <wp:effectExtent l="0" t="0" r="4445" b="4445"/>
-                  <wp:docPr id="1298621502" name="Picture 21"/>
+                  <wp:docPr id="1298621502" name="Picture 21" descr="Photo of Webb Ernest Earl"/>
                   <wp:cNvGraphicFramePr>
                     <a:graphicFrameLocks xmlns:a="http://schemas.openxmlformats.org/drawingml/2006/main"/>
                   </wp:cNvGraphicFramePr>
@@ -12415,7 +12415,7 @@
                     <a:graphicData uri="http://schemas.openxmlformats.org/drawingml/2006/picture">
                       <pic:pic xmlns:pic="http://schemas.openxmlformats.org/drawingml/2006/picture">
                         <pic:nvPicPr>
-                          <pic:cNvPr id="37" name="Picture 21"/>
+                          <pic:cNvPr id="37" name="Picture 21" descr="Photo of Webb Ernest Earl"/>
                           <pic:cNvPicPr preferRelativeResize="0">
                             <a:picLocks noChangeArrowheads="1"/>
                           </pic:cNvPicPr>
@@ -12767,7 +12767,7 @@
                 <wp:inline distT="0" distB="0" distL="0" distR="0" wp14:anchorId="65303512" wp14:editId="0570F29F">
                   <wp:extent cx="948055" cy="948055"/>
                   <wp:effectExtent l="0" t="0" r="4445" b="4445"/>
-                  <wp:docPr id="1501151361" name="Picture 20"/>
+                  <wp:docPr id="1501151361" name="Picture 20" descr="Photo of Martin Alice H"/>
                   <wp:cNvGraphicFramePr>
                     <a:graphicFrameLocks xmlns:a="http://schemas.openxmlformats.org/drawingml/2006/main"/>
                   </wp:cNvGraphicFramePr>
@@ -12775,7 +12775,7 @@
                     <a:graphicData uri="http://schemas.openxmlformats.org/drawingml/2006/picture">
                       <pic:pic xmlns:pic="http://schemas.openxmlformats.org/drawingml/2006/picture">
                         <pic:nvPicPr>
-                          <pic:cNvPr id="38" name="Picture 20"/>
+                          <pic:cNvPr id="38" name="Picture 20" descr="Photo of Martin Alice H"/>
                           <pic:cNvPicPr preferRelativeResize="0">
                             <a:picLocks noChangeArrowheads="1"/>
                           </pic:cNvPicPr>
@@ -13145,7 +13145,7 @@
                 <wp:inline distT="0" distB="0" distL="0" distR="0" wp14:anchorId="591873A2" wp14:editId="1A18FEB2">
                   <wp:extent cx="948055" cy="948055"/>
                   <wp:effectExtent l="0" t="0" r="4445" b="4445"/>
-                  <wp:docPr id="2082591195" name="Picture 19"/>
+                  <wp:docPr id="2082591195" name="Picture 19" descr="Photo of Berntsen Alberta D"/>
                   <wp:cNvGraphicFramePr>
                     <a:graphicFrameLocks xmlns:a="http://schemas.openxmlformats.org/drawingml/2006/main"/>
                   </wp:cNvGraphicFramePr>
@@ -13153,7 +13153,7 @@
                     <a:graphicData uri="http://schemas.openxmlformats.org/drawingml/2006/picture">
                       <pic:pic xmlns:pic="http://schemas.openxmlformats.org/drawingml/2006/picture">
                         <pic:nvPicPr>
-                          <pic:cNvPr id="39" name="Picture 19"/>
+                          <pic:cNvPr id="39" name="Picture 19" descr="Photo of Berntsen Alberta D"/>
                           <pic:cNvPicPr preferRelativeResize="0">
                             <a:picLocks noChangeArrowheads="1"/>
                           </pic:cNvPicPr>
@@ -13487,7 +13487,7 @@
                 <wp:inline distT="0" distB="0" distL="0" distR="0" wp14:anchorId="4BEFBB45" wp14:editId="46F02048">
                   <wp:extent cx="948055" cy="948055"/>
                   <wp:effectExtent l="0" t="0" r="4445" b="4445"/>
-                  <wp:docPr id="1346186462" name="Picture 18"/>
+                  <wp:docPr id="1346186462" name="Picture 18" descr="Photo of Geeter Tony Charles"/>
                   <wp:cNvGraphicFramePr>
                     <a:graphicFrameLocks xmlns:a="http://schemas.openxmlformats.org/drawingml/2006/main"/>
                   </wp:cNvGraphicFramePr>
@@ -13495,7 +13495,7 @@
                     <a:graphicData uri="http://schemas.openxmlformats.org/drawingml/2006/picture">
                       <pic:pic xmlns:pic="http://schemas.openxmlformats.org/drawingml/2006/picture">
                         <pic:nvPicPr>
-                          <pic:cNvPr id="40" name="Picture 18"/>
+                          <pic:cNvPr id="40" name="Picture 18" descr="Photo of Geeter Tony Charles"/>
                           <pic:cNvPicPr preferRelativeResize="0">
                             <a:picLocks noChangeArrowheads="1"/>
                           </pic:cNvPicPr>
@@ -13829,7 +13829,7 @@
                 <wp:inline distT="0" distB="0" distL="0" distR="0" wp14:anchorId="0513384F" wp14:editId="4D63F37C">
                   <wp:extent cx="948055" cy="948055"/>
                   <wp:effectExtent l="0" t="0" r="4445" b="4445"/>
-                  <wp:docPr id="471771788" name="Picture 16"/>
+                  <wp:docPr id="471771788" name="Picture 16" descr="Photo of Chase Arvil A"/>
                   <wp:cNvGraphicFramePr>
                     <a:graphicFrameLocks xmlns:a="http://schemas.openxmlformats.org/drawingml/2006/main"/>
                   </wp:cNvGraphicFramePr>
@@ -13837,7 +13837,7 @@
                     <a:graphicData uri="http://schemas.openxmlformats.org/drawingml/2006/picture">
                       <pic:pic xmlns:pic="http://schemas.openxmlformats.org/drawingml/2006/picture">
                         <pic:nvPicPr>
-                          <pic:cNvPr id="42" name="Picture 16"/>
+                          <pic:cNvPr id="42" name="Picture 16" descr="Photo of Chase Arvil A"/>
                           <pic:cNvPicPr preferRelativeResize="0">
                             <a:picLocks noChangeArrowheads="1"/>
                           </pic:cNvPicPr>
@@ -14171,7 +14171,7 @@
                 <wp:inline distT="0" distB="0" distL="0" distR="0" wp14:anchorId="0E80AC26" wp14:editId="7958E7F2">
                   <wp:extent cx="948055" cy="948055"/>
                   <wp:effectExtent l="0" t="0" r="4445" b="4445"/>
-                  <wp:docPr id="1902248027" name="Picture 15"/>
+                  <wp:docPr id="1902248027" name="Picture 15" descr="Photo of Waytz"/>
                   <wp:cNvGraphicFramePr>
                     <a:graphicFrameLocks xmlns:a="http://schemas.openxmlformats.org/drawingml/2006/main"/>
                   </wp:cNvGraphicFramePr>
@@ -14179,7 +14179,7 @@
                     <a:graphicData uri="http://schemas.openxmlformats.org/drawingml/2006/picture">
                       <pic:pic xmlns:pic="http://schemas.openxmlformats.org/drawingml/2006/picture">
                         <pic:nvPicPr>
-                          <pic:cNvPr id="43" name="Picture 15"/>
+                          <pic:cNvPr id="43" name="Picture 15" descr="Photo of Waytz"/>
                           <pic:cNvPicPr preferRelativeResize="0">
                             <a:picLocks noChangeArrowheads="1"/>
                           </pic:cNvPicPr>
@@ -14524,7 +14524,7 @@
                 <wp:inline distT="0" distB="0" distL="0" distR="0" wp14:anchorId="62C72D51" wp14:editId="0E2266C1">
                   <wp:extent cx="948055" cy="948055"/>
                   <wp:effectExtent l="0" t="0" r="4445" b="4445"/>
-                  <wp:docPr id="1769503903" name="Picture 14"/>
+                  <wp:docPr id="1769503903" name="Picture 14" descr="Photo of Basinger Almas D"/>
                   <wp:cNvGraphicFramePr>
                     <a:graphicFrameLocks xmlns:a="http://schemas.openxmlformats.org/drawingml/2006/main"/>
                   </wp:cNvGraphicFramePr>
@@ -14532,7 +14532,7 @@
                     <a:graphicData uri="http://schemas.openxmlformats.org/drawingml/2006/picture">
                       <pic:pic xmlns:pic="http://schemas.openxmlformats.org/drawingml/2006/picture">
                         <pic:nvPicPr>
-                          <pic:cNvPr id="44" name="Picture 14"/>
+                          <pic:cNvPr id="44" name="Picture 14" descr="Photo of Basinger Almas D"/>
                           <pic:cNvPicPr preferRelativeResize="0">
                             <a:picLocks noChangeArrowheads="1"/>
                           </pic:cNvPicPr>
@@ -14866,7 +14866,7 @@
                 <wp:inline distT="0" distB="0" distL="0" distR="0" wp14:anchorId="58CCA3EC" wp14:editId="3DB97C36">
                   <wp:extent cx="948055" cy="948055"/>
                   <wp:effectExtent l="0" t="0" r="4445" b="4445"/>
-                  <wp:docPr id="1209501014" name="Picture 13"/>
+                  <wp:docPr id="1209501014" name="Picture 13" descr="Photo of Andrews Anita"/>
                   <wp:cNvGraphicFramePr>
                     <a:graphicFrameLocks xmlns:a="http://schemas.openxmlformats.org/drawingml/2006/main"/>
                   </wp:cNvGraphicFramePr>
@@ -14874,7 +14874,7 @@
                     <a:graphicData uri="http://schemas.openxmlformats.org/drawingml/2006/picture">
                       <pic:pic xmlns:pic="http://schemas.openxmlformats.org/drawingml/2006/picture">
                         <pic:nvPicPr>
-                          <pic:cNvPr id="45" name="Picture 13"/>
+                          <pic:cNvPr id="45" name="Picture 13" descr="Photo of Andrews Anita"/>
                           <pic:cNvPicPr preferRelativeResize="0">
                             <a:picLocks noChangeArrowheads="1"/>
                           </pic:cNvPicPr>
@@ -15208,7 +15208,7 @@
                 <wp:inline distT="0" distB="0" distL="0" distR="0" wp14:anchorId="0FDEF78A" wp14:editId="77CB2D64">
                   <wp:extent cx="948055" cy="948055"/>
                   <wp:effectExtent l="0" t="0" r="4445" b="4445"/>
-                  <wp:docPr id="1123439723" name="Picture 10"/>
+                  <wp:docPr id="1123439723" name="Picture 10" descr="Photo of Liu Calvin"/>
                   <wp:cNvGraphicFramePr>
                     <a:graphicFrameLocks xmlns:a="http://schemas.openxmlformats.org/drawingml/2006/main"/>
                   </wp:cNvGraphicFramePr>
@@ -15216,7 +15216,7 @@
                     <a:graphicData uri="http://schemas.openxmlformats.org/drawingml/2006/picture">
                       <pic:pic xmlns:pic="http://schemas.openxmlformats.org/drawingml/2006/picture">
                         <pic:nvPicPr>
-                          <pic:cNvPr id="48" name="Picture 10"/>
+                          <pic:cNvPr id="48" name="Picture 10" descr="Photo of Liu Calvin"/>
                           <pic:cNvPicPr preferRelativeResize="0">
                             <a:picLocks noChangeArrowheads="1"/>
                           </pic:cNvPicPr>
@@ -15550,7 +15550,7 @@
                 <wp:inline distT="0" distB="0" distL="0" distR="0" wp14:anchorId="48994160" wp14:editId="3A6DD704">
                   <wp:extent cx="948055" cy="948055"/>
                   <wp:effectExtent l="0" t="0" r="4445" b="4445"/>
-                  <wp:docPr id="1429765237" name="Picture 9"/>
+                  <wp:docPr id="1429765237" name="Picture 9" descr="Photo of Stormo Amos L"/>
                   <wp:cNvGraphicFramePr>
                     <a:graphicFrameLocks xmlns:a="http://schemas.openxmlformats.org/drawingml/2006/main"/>
                   </wp:cNvGraphicFramePr>
@@ -15558,7 +15558,7 @@
                     <a:graphicData uri="http://schemas.openxmlformats.org/drawingml/2006/picture">
                       <pic:pic xmlns:pic="http://schemas.openxmlformats.org/drawingml/2006/picture">
                         <pic:nvPicPr>
-                          <pic:cNvPr id="49" name="Picture 9"/>
+                          <pic:cNvPr id="49" name="Picture 9" descr="Photo of Stormo Amos L"/>
                           <pic:cNvPicPr preferRelativeResize="0">
                             <a:picLocks noChangeArrowheads="1"/>
                           </pic:cNvPicPr>
@@ -15892,7 +15892,7 @@
                 <wp:inline distT="0" distB="0" distL="0" distR="0" wp14:anchorId="22DE97CF" wp14:editId="5072B47E">
                   <wp:extent cx="948055" cy="948055"/>
                   <wp:effectExtent l="0" t="0" r="4445" b="4445"/>
-                  <wp:docPr id="136346353" name="Picture 8"/>
+                  <wp:docPr id="136346353" name="Picture 8" descr="Photo of Brandt Arthur"/>
                   <wp:cNvGraphicFramePr>
                     <a:graphicFrameLocks xmlns:a="http://schemas.openxmlformats.org/drawingml/2006/main"/>
                   </wp:cNvGraphicFramePr>
@@ -15900,7 +15900,7 @@
                     <a:graphicData uri="http://schemas.openxmlformats.org/drawingml/2006/picture">
                       <pic:pic xmlns:pic="http://schemas.openxmlformats.org/drawingml/2006/picture">
                         <pic:nvPicPr>
-                          <pic:cNvPr id="50" name="Picture 8"/>
+                          <pic:cNvPr id="50" name="Picture 8" descr="Photo of Brandt Arthur"/>
                           <pic:cNvPicPr preferRelativeResize="0">
                             <a:picLocks noChangeArrowheads="1"/>
                           </pic:cNvPicPr>
@@ -16234,7 +16234,7 @@
                 <wp:inline distT="0" distB="0" distL="0" distR="0" wp14:anchorId="5B832CE0" wp14:editId="525D64D1">
                   <wp:extent cx="948055" cy="948055"/>
                   <wp:effectExtent l="0" t="0" r="4445" b="4445"/>
-                  <wp:docPr id="449221385" name="Picture 7"/>
+                  <wp:docPr id="449221385" name="Picture 7" descr="Photo of Smodey"/>
                   <wp:cNvGraphicFramePr>
                     <a:graphicFrameLocks xmlns:a="http://schemas.openxmlformats.org/drawingml/2006/main"/>
                   </wp:cNvGraphicFramePr>
@@ -16242,7 +16242,7 @@
                     <a:graphicData uri="http://schemas.openxmlformats.org/drawingml/2006/picture">
                       <pic:pic xmlns:pic="http://schemas.openxmlformats.org/drawingml/2006/picture">
                         <pic:nvPicPr>
-                          <pic:cNvPr id="51" name="Picture 7"/>
+                          <pic:cNvPr id="51" name="Picture 7" descr="Photo of Smodey"/>
                           <pic:cNvPicPr preferRelativeResize="0">
                             <a:picLocks noChangeArrowheads="1"/>
                           </pic:cNvPicPr>
@@ -16573,7 +16573,7 @@
                 <wp:inline distT="0" distB="0" distL="0" distR="0" wp14:anchorId="63F17ECA" wp14:editId="4299F58E">
                   <wp:extent cx="948055" cy="948055"/>
                   <wp:effectExtent l="0" t="0" r="4445" b="4445"/>
-                  <wp:docPr id="665321595" name="Picture 6"/>
+                  <wp:docPr id="665321595" name="Picture 6" descr="Photo of Hazel Anthony J"/>
                   <wp:cNvGraphicFramePr>
                     <a:graphicFrameLocks xmlns:a="http://schemas.openxmlformats.org/drawingml/2006/main"/>
                   </wp:cNvGraphicFramePr>
@@ -16581,7 +16581,7 @@
                     <a:graphicData uri="http://schemas.openxmlformats.org/drawingml/2006/picture">
                       <pic:pic xmlns:pic="http://schemas.openxmlformats.org/drawingml/2006/picture">
                         <pic:nvPicPr>
-                          <pic:cNvPr id="52" name="Picture 6"/>
+                          <pic:cNvPr id="52" name="Picture 6" descr="Photo of Hazel Anthony J"/>
                           <pic:cNvPicPr preferRelativeResize="0">
                             <a:picLocks noChangeArrowheads="1"/>
                           </pic:cNvPicPr>
@@ -16915,7 +16915,7 @@
                 <wp:inline distT="0" distB="0" distL="0" distR="0" wp14:anchorId="276E3130" wp14:editId="4961C7CB">
                   <wp:extent cx="948055" cy="948055"/>
                   <wp:effectExtent l="0" t="0" r="4445" b="4445"/>
-                  <wp:docPr id="1987313500" name="Picture 5"/>
+                  <wp:docPr id="1987313500" name="Picture 5" descr="Photo of Carter Andrew Dennis"/>
                   <wp:cNvGraphicFramePr>
                     <a:graphicFrameLocks xmlns:a="http://schemas.openxmlformats.org/drawingml/2006/main"/>
                   </wp:cNvGraphicFramePr>
@@ -16923,7 +16923,7 @@
                     <a:graphicData uri="http://schemas.openxmlformats.org/drawingml/2006/picture">
                       <pic:pic xmlns:pic="http://schemas.openxmlformats.org/drawingml/2006/picture">
                         <pic:nvPicPr>
-                          <pic:cNvPr id="53" name="Picture 5"/>
+                          <pic:cNvPr id="53" name="Picture 5" descr="Photo of Carter Andrew Dennis"/>
                           <pic:cNvPicPr preferRelativeResize="0">
                             <a:picLocks noChangeArrowheads="1"/>
                           </pic:cNvPicPr>

</xml_diff>